<commit_message>
Changes made on all files
</commit_message>
<xml_diff>
--- a/MD1 Assgn+Adhikari+R_NURS_6052.docx
+++ b/MD1 Assgn+Adhikari+R_NURS_6052.docx
@@ -4,6 +4,163 @@
   <w:body>
     <w:p>
       <w:pPr>
+        <w:pStyle w:val="Heading2"/>
+        <w:spacing w:before="300" w:beforeAutospacing="0" w:after="0" w:afterAutospacing="0" w:line="480" w:lineRule="auto"/>
+        <w:ind w:firstLine="245"/>
+        <w:jc w:val="both"/>
+        <w:rPr>
+          <w:b w:val="0"/>
+          <w:bCs w:val="0"/>
+          <w:caps/>
+          <w:sz w:val="24"/>
+          <w:szCs w:val="24"/>
+        </w:rPr>
+      </w:pPr>
+      <w:r>
+        <w:rPr>
+          <w:color w:val="2D3B45"/>
+          <w:sz w:val="24"/>
+          <w:szCs w:val="24"/>
+        </w:rPr>
+        <w:t xml:space="preserve">Topic: </w:t>
+      </w:r>
+      <w:r>
+        <w:rPr>
+          <w:b w:val="0"/>
+          <w:bCs w:val="0"/>
+          <w:caps/>
+          <w:sz w:val="24"/>
+          <w:szCs w:val="24"/>
+        </w:rPr>
+        <w:t>Evidence-Based Practice and the Quadruple Aim</w:t>
+      </w:r>
+    </w:p>
+    <w:p>
+      <w:pPr>
+        <w:pStyle w:val="Heading2"/>
+        <w:spacing w:before="300" w:beforeAutospacing="0" w:after="0" w:afterAutospacing="0" w:line="480" w:lineRule="auto"/>
+        <w:ind w:firstLine="245"/>
+        <w:jc w:val="both"/>
+        <w:rPr>
+          <w:b w:val="0"/>
+          <w:bCs w:val="0"/>
+          <w:caps/>
+          <w:sz w:val="24"/>
+          <w:szCs w:val="24"/>
+        </w:rPr>
+      </w:pPr>
+      <w:r>
+        <w:rPr>
+          <w:color w:val="273540"/>
+          <w:sz w:val="24"/>
+          <w:szCs w:val="24"/>
+        </w:rPr>
+        <w:t>Write a brief analysis (no longer than 2 pages) of the connection between EBP and the Quadruple Aim.</w:t>
+      </w:r>
+    </w:p>
+    <w:p>
+      <w:pPr>
+        <w:pStyle w:val="NormalWeb"/>
+        <w:shd w:val="clear" w:color="auto" w:fill="FFFFFF"/>
+        <w:spacing w:before="180" w:beforeAutospacing="0" w:after="180" w:afterAutospacing="0" w:line="480" w:lineRule="auto"/>
+        <w:jc w:val="both"/>
+        <w:rPr>
+          <w:color w:val="273540"/>
+        </w:rPr>
+      </w:pPr>
+      <w:r>
+        <w:rPr>
+          <w:color w:val="273540"/>
+        </w:rPr>
+        <w:t>Your analysis should address how EBP might (or might not) help reach the Quadruple Aim, including each of the four measures of:</w:t>
+      </w:r>
+    </w:p>
+    <w:p>
+      <w:pPr>
+        <w:numPr>
+          <w:ilvl w:val="0"/>
+          <w:numId w:val="4"/>
+        </w:numPr>
+        <w:shd w:val="clear" w:color="auto" w:fill="FFFFFF"/>
+        <w:spacing w:before="100" w:beforeAutospacing="1" w:after="100" w:afterAutospacing="1" w:line="480" w:lineRule="auto"/>
+        <w:ind w:left="1095"/>
+        <w:jc w:val="both"/>
+        <w:rPr>
+          <w:color w:val="273540"/>
+        </w:rPr>
+      </w:pPr>
+      <w:r>
+        <w:rPr>
+          <w:color w:val="273540"/>
+        </w:rPr>
+        <w:t>Patient experience</w:t>
+      </w:r>
+    </w:p>
+    <w:p>
+      <w:pPr>
+        <w:numPr>
+          <w:ilvl w:val="0"/>
+          <w:numId w:val="4"/>
+        </w:numPr>
+        <w:shd w:val="clear" w:color="auto" w:fill="FFFFFF"/>
+        <w:spacing w:before="100" w:beforeAutospacing="1" w:after="100" w:afterAutospacing="1" w:line="480" w:lineRule="auto"/>
+        <w:ind w:left="1095"/>
+        <w:jc w:val="both"/>
+        <w:rPr>
+          <w:color w:val="273540"/>
+        </w:rPr>
+      </w:pPr>
+      <w:r>
+        <w:rPr>
+          <w:color w:val="273540"/>
+        </w:rPr>
+        <w:t>Population health</w:t>
+      </w:r>
+    </w:p>
+    <w:p>
+      <w:pPr>
+        <w:numPr>
+          <w:ilvl w:val="0"/>
+          <w:numId w:val="4"/>
+        </w:numPr>
+        <w:shd w:val="clear" w:color="auto" w:fill="FFFFFF"/>
+        <w:spacing w:before="100" w:beforeAutospacing="1" w:after="100" w:afterAutospacing="1" w:line="480" w:lineRule="auto"/>
+        <w:ind w:left="1095"/>
+        <w:jc w:val="both"/>
+        <w:rPr>
+          <w:color w:val="273540"/>
+        </w:rPr>
+      </w:pPr>
+      <w:r>
+        <w:rPr>
+          <w:color w:val="273540"/>
+        </w:rPr>
+        <w:t>Costs</w:t>
+      </w:r>
+    </w:p>
+    <w:p>
+      <w:pPr>
+        <w:numPr>
+          <w:ilvl w:val="0"/>
+          <w:numId w:val="4"/>
+        </w:numPr>
+        <w:shd w:val="clear" w:color="auto" w:fill="FFFFFF"/>
+        <w:spacing w:before="100" w:beforeAutospacing="1" w:after="100" w:afterAutospacing="1" w:line="480" w:lineRule="auto"/>
+        <w:ind w:left="1095"/>
+        <w:jc w:val="both"/>
+        <w:rPr>
+          <w:color w:val="273540"/>
+        </w:rPr>
+      </w:pPr>
+      <w:r>
+        <w:rPr>
+          <w:color w:val="273540"/>
+        </w:rPr>
+        <w:t>Work life of healthcare providers</w:t>
+      </w:r>
+    </w:p>
+    <w:p>
+      <w:pPr>
         <w:shd w:val="clear" w:color="auto" w:fill="FFFFFF"/>
         <w:spacing w:before="100" w:beforeAutospacing="1" w:after="100" w:afterAutospacing="1"/>
         <w:rPr>
@@ -294,7 +451,11 @@
         <w:t>.</w:t>
       </w:r>
       <w:r>
-        <w:t xml:space="preserve"> EBP provides different techniques and technologies for handling different types of patients. EBP implementation in Nursing as well as other health care discipline are considered essential for optimal patient outcomes and quality patient care. (Kim et al., 2016)</w:t>
+        <w:t xml:space="preserve"> EBP provides </w:t>
+      </w:r>
+      <w:r>
+        <w:lastRenderedPageBreak/>
+        <w:t>different techniques and technologies for handling different types of patients. EBP implementation in Nursing as well as other health care discipline are considered essential for optimal patient outcomes and quality patient care. (Kim et al., 2016)</w:t>
       </w:r>
       <w:r>
         <w:t xml:space="preserve"> By applying the rule of guiding evidence to evaluate the finding based on research and </w:t>
@@ -358,7 +519,6 @@
         <w:t xml:space="preserve">approach leads to successful preventative programs and policies both in the hospital and </w:t>
       </w:r>
       <w:r>
-        <w:lastRenderedPageBreak/>
         <w:t>community. Evidence-based practice includes processes to boost population health and decrease disease burden and this is achieved by using risk factor and disease burden data, evidence, and assessment of the committee</w:t>
       </w:r>
       <w:r>
@@ -459,7 +619,11 @@
         <w:t xml:space="preserve"> </w:t>
       </w:r>
       <w:r>
-        <w:t xml:space="preserve">falls, decreasing ventilator-associated pneumonia for the vented patient, Catheter-associated urinary tract infection, pressure ulcers, surgical site infections, and more. EVP plays a crucial role here because it provides healthcare providers with a foundation for obtaining needed resources to prevent all the above-mentioned problems. EBP is the best and right thing to decrease the cost of the organization and provide quality patient care. </w:t>
+        <w:t xml:space="preserve">falls, decreasing ventilator-associated pneumonia for the vented patient, Catheter-associated urinary tract infection, pressure ulcers, surgical site infections, and more. EVP plays a crucial </w:t>
+      </w:r>
+      <w:r>
+        <w:lastRenderedPageBreak/>
+        <w:t xml:space="preserve">role here because it provides healthcare providers with a foundation for obtaining needed resources to prevent all the above-mentioned problems. EBP is the best and right thing to decrease the cost of the organization and provide quality patient care. </w:t>
       </w:r>
     </w:p>
     <w:p>
@@ -526,35 +690,27 @@
           <w:color w:val="455560"/>
           <w:shd w:val="clear" w:color="auto" w:fill="FFFFFF"/>
         </w:rPr>
-        <w:t xml:space="preserve"> </w:t>
+        <w:t xml:space="preserve"> focus on how to support Nurses, and how to prevent burnout among nurses and this can be achieved</w:t>
       </w:r>
       <w:r>
         <w:rPr>
           <w:color w:val="455560"/>
           <w:shd w:val="clear" w:color="auto" w:fill="FFFFFF"/>
         </w:rPr>
-        <w:lastRenderedPageBreak/>
-        <w:t>focus on how to support Nurses, and how to prevent burnout among nurses and this can be achieved</w:t>
+        <w:t xml:space="preserve"> </w:t>
       </w:r>
       <w:r>
         <w:rPr>
           <w:color w:val="455560"/>
           <w:shd w:val="clear" w:color="auto" w:fill="FFFFFF"/>
         </w:rPr>
-        <w:t xml:space="preserve"> </w:t>
+        <w:t>following an evidence-based approach. Staff will focus on the best patient outcomes and patient satisfaction when they feel respected, supported, and empowered.</w:t>
       </w:r>
       <w:r>
         <w:rPr>
           <w:color w:val="455560"/>
           <w:shd w:val="clear" w:color="auto" w:fill="FFFFFF"/>
         </w:rPr>
-        <w:t>following an evidence-based approach. Staff will focus on the best patient outcomes and patient satisfaction when they feel respected, supported, and empowered.</w:t>
-      </w:r>
-      <w:r>
-        <w:rPr>
-          <w:color w:val="455560"/>
-          <w:shd w:val="clear" w:color="auto" w:fill="FFFFFF"/>
-        </w:rPr>
         <w:t xml:space="preserve"> </w:t>
       </w:r>
       <w:r>
@@ -611,6 +767,7 @@
         <w:spacing w:after="255" w:line="480" w:lineRule="auto"/>
       </w:pPr>
       <w:r>
+        <w:lastRenderedPageBreak/>
         <w:t xml:space="preserve">EBP plays a very important role in achieving </w:t>
       </w:r>
       <w:r>
@@ -769,6 +926,7 @@
         <w:rPr>
           <w:color w:val="2D3B45"/>
         </w:rPr>
+        <w:lastRenderedPageBreak/>
         <w:t xml:space="preserve">Kim, S. C., </w:t>
       </w:r>
       <w:proofErr w:type="spellStart"/>
@@ -1702,6 +1860,155 @@
       </w:rPr>
     </w:lvl>
   </w:abstractNum>
+  <w:abstractNum w:abstractNumId="3" w15:restartNumberingAfterBreak="0">
+    <w:nsid w:val="454F3DCB"/>
+    <w:multiLevelType w:val="multilevel"/>
+    <w:tmpl w:val="A0F2E4B0"/>
+    <w:lvl w:ilvl="0">
+      <w:start w:val="1"/>
+      <w:numFmt w:val="bullet"/>
+      <w:lvlText w:val=""/>
+      <w:lvlJc w:val="left"/>
+      <w:pPr>
+        <w:tabs>
+          <w:tab w:val="num" w:pos="720"/>
+        </w:tabs>
+        <w:ind w:left="720" w:hanging="360"/>
+      </w:pPr>
+      <w:rPr>
+        <w:rFonts w:ascii="Symbol" w:hAnsi="Symbol" w:hint="default"/>
+        <w:sz w:val="20"/>
+      </w:rPr>
+    </w:lvl>
+    <w:lvl w:ilvl="1" w:tentative="1">
+      <w:start w:val="1"/>
+      <w:numFmt w:val="bullet"/>
+      <w:lvlText w:val="o"/>
+      <w:lvlJc w:val="left"/>
+      <w:pPr>
+        <w:tabs>
+          <w:tab w:val="num" w:pos="1440"/>
+        </w:tabs>
+        <w:ind w:left="1440" w:hanging="360"/>
+      </w:pPr>
+      <w:rPr>
+        <w:rFonts w:ascii="Courier New" w:hAnsi="Courier New" w:hint="default"/>
+        <w:sz w:val="20"/>
+      </w:rPr>
+    </w:lvl>
+    <w:lvl w:ilvl="2" w:tentative="1">
+      <w:start w:val="1"/>
+      <w:numFmt w:val="bullet"/>
+      <w:lvlText w:val=""/>
+      <w:lvlJc w:val="left"/>
+      <w:pPr>
+        <w:tabs>
+          <w:tab w:val="num" w:pos="2160"/>
+        </w:tabs>
+        <w:ind w:left="2160" w:hanging="360"/>
+      </w:pPr>
+      <w:rPr>
+        <w:rFonts w:ascii="Wingdings" w:hAnsi="Wingdings" w:hint="default"/>
+        <w:sz w:val="20"/>
+      </w:rPr>
+    </w:lvl>
+    <w:lvl w:ilvl="3" w:tentative="1">
+      <w:start w:val="1"/>
+      <w:numFmt w:val="bullet"/>
+      <w:lvlText w:val=""/>
+      <w:lvlJc w:val="left"/>
+      <w:pPr>
+        <w:tabs>
+          <w:tab w:val="num" w:pos="2880"/>
+        </w:tabs>
+        <w:ind w:left="2880" w:hanging="360"/>
+      </w:pPr>
+      <w:rPr>
+        <w:rFonts w:ascii="Wingdings" w:hAnsi="Wingdings" w:hint="default"/>
+        <w:sz w:val="20"/>
+      </w:rPr>
+    </w:lvl>
+    <w:lvl w:ilvl="4" w:tentative="1">
+      <w:start w:val="1"/>
+      <w:numFmt w:val="bullet"/>
+      <w:lvlText w:val=""/>
+      <w:lvlJc w:val="left"/>
+      <w:pPr>
+        <w:tabs>
+          <w:tab w:val="num" w:pos="3600"/>
+        </w:tabs>
+        <w:ind w:left="3600" w:hanging="360"/>
+      </w:pPr>
+      <w:rPr>
+        <w:rFonts w:ascii="Wingdings" w:hAnsi="Wingdings" w:hint="default"/>
+        <w:sz w:val="20"/>
+      </w:rPr>
+    </w:lvl>
+    <w:lvl w:ilvl="5" w:tentative="1">
+      <w:start w:val="1"/>
+      <w:numFmt w:val="bullet"/>
+      <w:lvlText w:val=""/>
+      <w:lvlJc w:val="left"/>
+      <w:pPr>
+        <w:tabs>
+          <w:tab w:val="num" w:pos="4320"/>
+        </w:tabs>
+        <w:ind w:left="4320" w:hanging="360"/>
+      </w:pPr>
+      <w:rPr>
+        <w:rFonts w:ascii="Wingdings" w:hAnsi="Wingdings" w:hint="default"/>
+        <w:sz w:val="20"/>
+      </w:rPr>
+    </w:lvl>
+    <w:lvl w:ilvl="6" w:tentative="1">
+      <w:start w:val="1"/>
+      <w:numFmt w:val="bullet"/>
+      <w:lvlText w:val=""/>
+      <w:lvlJc w:val="left"/>
+      <w:pPr>
+        <w:tabs>
+          <w:tab w:val="num" w:pos="5040"/>
+        </w:tabs>
+        <w:ind w:left="5040" w:hanging="360"/>
+      </w:pPr>
+      <w:rPr>
+        <w:rFonts w:ascii="Wingdings" w:hAnsi="Wingdings" w:hint="default"/>
+        <w:sz w:val="20"/>
+      </w:rPr>
+    </w:lvl>
+    <w:lvl w:ilvl="7" w:tentative="1">
+      <w:start w:val="1"/>
+      <w:numFmt w:val="bullet"/>
+      <w:lvlText w:val=""/>
+      <w:lvlJc w:val="left"/>
+      <w:pPr>
+        <w:tabs>
+          <w:tab w:val="num" w:pos="5760"/>
+        </w:tabs>
+        <w:ind w:left="5760" w:hanging="360"/>
+      </w:pPr>
+      <w:rPr>
+        <w:rFonts w:ascii="Wingdings" w:hAnsi="Wingdings" w:hint="default"/>
+        <w:sz w:val="20"/>
+      </w:rPr>
+    </w:lvl>
+    <w:lvl w:ilvl="8" w:tentative="1">
+      <w:start w:val="1"/>
+      <w:numFmt w:val="bullet"/>
+      <w:lvlText w:val=""/>
+      <w:lvlJc w:val="left"/>
+      <w:pPr>
+        <w:tabs>
+          <w:tab w:val="num" w:pos="6480"/>
+        </w:tabs>
+        <w:ind w:left="6480" w:hanging="360"/>
+      </w:pPr>
+      <w:rPr>
+        <w:rFonts w:ascii="Wingdings" w:hAnsi="Wingdings" w:hint="default"/>
+        <w:sz w:val="20"/>
+      </w:rPr>
+    </w:lvl>
+  </w:abstractNum>
   <w:num w:numId="1" w16cid:durableId="2111731145">
     <w:abstractNumId w:val="0"/>
   </w:num>
@@ -1710,6 +2017,9 @@
   </w:num>
   <w:num w:numId="3" w16cid:durableId="1854875340">
     <w:abstractNumId w:val="1"/>
+  </w:num>
+  <w:num w:numId="4" w16cid:durableId="897127352">
+    <w:abstractNumId w:val="3"/>
   </w:num>
 </w:numbering>
 </file>
@@ -2110,6 +2420,24 @@
       <w:rFonts w:ascii="Times New Roman" w:eastAsia="Times New Roman" w:hAnsi="Times New Roman" w:cs="Times New Roman"/>
     </w:rPr>
   </w:style>
+  <w:style w:type="paragraph" w:styleId="Heading2">
+    <w:name w:val="heading 2"/>
+    <w:basedOn w:val="Normal"/>
+    <w:link w:val="Heading2Char"/>
+    <w:uiPriority w:val="9"/>
+    <w:qFormat/>
+    <w:rsid w:val="005D3609"/>
+    <w:pPr>
+      <w:spacing w:before="100" w:beforeAutospacing="1" w:after="100" w:afterAutospacing="1"/>
+      <w:outlineLvl w:val="1"/>
+    </w:pPr>
+    <w:rPr>
+      <w:b/>
+      <w:bCs/>
+      <w:sz w:val="36"/>
+      <w:szCs w:val="36"/>
+    </w:rPr>
+  </w:style>
   <w:style w:type="character" w:default="1" w:styleId="DefaultParagraphFont">
     <w:name w:val="Default Paragraph Font"/>
     <w:uiPriority w:val="1"/>
@@ -2151,7 +2479,6 @@
     <w:name w:val="Normal (Web)"/>
     <w:basedOn w:val="Normal"/>
     <w:uiPriority w:val="99"/>
-    <w:semiHidden/>
     <w:unhideWhenUsed/>
     <w:rsid w:val="00121A67"/>
     <w:pPr>
@@ -2215,6 +2542,31 @@
     <w:semiHidden/>
     <w:unhideWhenUsed/>
     <w:rsid w:val="003F04AC"/>
+  </w:style>
+  <w:style w:type="character" w:styleId="Strong">
+    <w:name w:val="Strong"/>
+    <w:basedOn w:val="DefaultParagraphFont"/>
+    <w:uiPriority w:val="22"/>
+    <w:qFormat/>
+    <w:rsid w:val="005D3609"/>
+    <w:rPr>
+      <w:b/>
+      <w:bCs/>
+    </w:rPr>
+  </w:style>
+  <w:style w:type="character" w:customStyle="1" w:styleId="Heading2Char">
+    <w:name w:val="Heading 2 Char"/>
+    <w:basedOn w:val="DefaultParagraphFont"/>
+    <w:link w:val="Heading2"/>
+    <w:uiPriority w:val="9"/>
+    <w:rsid w:val="005D3609"/>
+    <w:rPr>
+      <w:rFonts w:ascii="Times New Roman" w:eastAsia="Times New Roman" w:hAnsi="Times New Roman" w:cs="Times New Roman"/>
+      <w:b/>
+      <w:bCs/>
+      <w:sz w:val="36"/>
+      <w:szCs w:val="36"/>
+    </w:rPr>
   </w:style>
 </w:styles>
 </file>

</xml_diff>